<commit_message>
Adicionando o projeto ECU ABS
</commit_message>
<xml_diff>
--- a/Funcionamento e Resultados Esperados da Simulação de ECU ABS no Simulink.docx
+++ b/Funcionamento e Resultados Esperados da Simulação de ECU ABS no Simulink.docx
@@ -20,46 +20,20 @@
           <w:szCs w:val="40"/>
           <w:lang w:val="pt-BR"/>
         </w:rPr>
-        <w:t xml:space="preserve">Funcionamento e Resultados Esperados da Simulação de ECU ABS no </w:t>
-      </w:r>
-      <w:proofErr w:type="spellStart"/>
-      <w:r>
-        <w:rPr>
-          <w:b/>
-          <w:bCs/>
-          <w:sz w:val="40"/>
-          <w:szCs w:val="40"/>
-          <w:lang w:val="pt-BR"/>
-        </w:rPr>
-        <w:t>Simulink</w:t>
-      </w:r>
-      <w:proofErr w:type="spellEnd"/>
-    </w:p>
-    <w:p>
-      <w:pPr>
-        <w:rPr>
-          <w:lang w:val="pt-BR"/>
-        </w:rPr>
-      </w:pPr>
-      <w:r>
-        <w:rPr>
-          <w:lang w:val="pt-BR"/>
-        </w:rPr>
-        <w:t xml:space="preserve">Esta simulação no </w:t>
-      </w:r>
-      <w:proofErr w:type="spellStart"/>
-      <w:r>
-        <w:rPr>
-          <w:lang w:val="pt-BR"/>
-        </w:rPr>
-        <w:t>Simulink</w:t>
-      </w:r>
-      <w:proofErr w:type="spellEnd"/>
-      <w:r>
-        <w:rPr>
-          <w:lang w:val="pt-BR"/>
-        </w:rPr>
-        <w:t xml:space="preserve"> representa uma versão simplificada de uma </w:t>
+        <w:t>Funcionamento e Resultados Esperados da Simulação de ECU ABS no Simulink</w:t>
+      </w:r>
+    </w:p>
+    <w:p>
+      <w:pPr>
+        <w:rPr>
+          <w:lang w:val="pt-BR"/>
+        </w:rPr>
+      </w:pPr>
+      <w:r>
+        <w:rPr>
+          <w:lang w:val="pt-BR"/>
+        </w:rPr>
+        <w:t xml:space="preserve">Esta simulação no Simulink representa uma versão simplificada de uma </w:t>
       </w:r>
       <w:r>
         <w:rPr>
@@ -156,91 +130,23 @@
         <w:rPr>
           <w:lang w:val="pt-BR"/>
         </w:rPr>
-        <w:t xml:space="preserve"> Quatro sinais (Velocidade Roda </w:t>
-      </w:r>
-      <w:proofErr w:type="spellStart"/>
-      <w:r>
-        <w:rPr>
-          <w:lang w:val="pt-BR"/>
-        </w:rPr>
-        <w:t>Diant</w:t>
-      </w:r>
-      <w:proofErr w:type="spellEnd"/>
-      <w:r>
-        <w:rPr>
-          <w:lang w:val="pt-BR"/>
-        </w:rPr>
-        <w:t xml:space="preserve">. Esq., Velocidade Roda </w:t>
-      </w:r>
-      <w:proofErr w:type="spellStart"/>
-      <w:r>
-        <w:rPr>
-          <w:lang w:val="pt-BR"/>
-        </w:rPr>
-        <w:t>Diant</w:t>
-      </w:r>
-      <w:proofErr w:type="spellEnd"/>
-      <w:r>
-        <w:rPr>
-          <w:lang w:val="pt-BR"/>
-        </w:rPr>
-        <w:t xml:space="preserve">. Dir., Velocidade Roda </w:t>
-      </w:r>
-      <w:proofErr w:type="spellStart"/>
-      <w:r>
-        <w:rPr>
-          <w:lang w:val="pt-BR"/>
-        </w:rPr>
-        <w:t>Tras</w:t>
-      </w:r>
-      <w:proofErr w:type="spellEnd"/>
-      <w:r>
-        <w:rPr>
-          <w:lang w:val="pt-BR"/>
-        </w:rPr>
-        <w:t xml:space="preserve">. Esq., Velocidade Roda </w:t>
-      </w:r>
-      <w:proofErr w:type="spellStart"/>
-      <w:r>
-        <w:rPr>
-          <w:lang w:val="pt-BR"/>
-        </w:rPr>
-        <w:t>Tras</w:t>
-      </w:r>
-      <w:proofErr w:type="spellEnd"/>
-      <w:r>
-        <w:rPr>
-          <w:lang w:val="pt-BR"/>
-        </w:rPr>
-        <w:t>. Dir.). No nosso cenário, simulamos uma frenagem brusca onde as velocidades caem de um valor inicial (</w:t>
-      </w:r>
-      <w:proofErr w:type="spellStart"/>
-      <w:r>
-        <w:rPr>
-          <w:lang w:val="pt-BR"/>
-        </w:rPr>
-        <w:t>ex</w:t>
-      </w:r>
-      <w:proofErr w:type="spellEnd"/>
-      <w:r>
-        <w:rPr>
-          <w:lang w:val="pt-BR"/>
-        </w:rPr>
-        <w:t>: 30 m/s) para um valor mais baixo (</w:t>
-      </w:r>
-      <w:proofErr w:type="spellStart"/>
-      <w:r>
-        <w:rPr>
-          <w:lang w:val="pt-BR"/>
-        </w:rPr>
-        <w:t>ex</w:t>
-      </w:r>
-      <w:proofErr w:type="spellEnd"/>
-      <w:r>
-        <w:rPr>
-          <w:lang w:val="pt-BR"/>
-        </w:rPr>
-        <w:t>: 10 m/s), indicando uma desaceleração severa e potencial travamento.</w:t>
+        <w:t xml:space="preserve"> Quatro sinais (</w:t>
+      </w:r>
+      <w:r>
+        <w:rPr>
+          <w:b/>
+          <w:bCs/>
+          <w:i/>
+          <w:iCs/>
+          <w:lang w:val="pt-BR"/>
+        </w:rPr>
+        <w:t>Velocidade Roda Diant. Esq., Velocidade Roda Diant. Dir., Velocidade Roda Tras. Esq., Velocidade Roda Tras. Dir.</w:t>
+      </w:r>
+      <w:r>
+        <w:rPr>
+          <w:lang w:val="pt-BR"/>
+        </w:rPr>
+        <w:t>). No nosso cenário, simulamos uma frenagem brusca onde as velocidades caem de um valor inicial (ex: 30 m/s) para um valor mais baixo (ex: 10 m/s), indicando uma desaceleração severa e potencial travamento.</w:t>
       </w:r>
     </w:p>
     <w:p>
@@ -265,83 +171,37 @@
         <w:rPr>
           <w:lang w:val="pt-BR"/>
         </w:rPr>
-        <w:t xml:space="preserve"> Um valor constante (</w:t>
-      </w:r>
-      <w:proofErr w:type="spellStart"/>
-      <w:r>
-        <w:rPr>
-          <w:lang w:val="pt-BR"/>
-        </w:rPr>
-        <w:t>ex</w:t>
-      </w:r>
-      <w:proofErr w:type="spellEnd"/>
-      <w:r>
-        <w:rPr>
-          <w:lang w:val="pt-BR"/>
-        </w:rPr>
-        <w:t>: 25 m/s). Em um sistema real, esta seria uma velocidade calculada dinamicamente, mas para simplificação, usamos uma constante para representar uma velocidade média do veículo durante a frenagem.</w:t>
-      </w:r>
-    </w:p>
-    <w:p>
-      <w:pPr>
-        <w:rPr>
-          <w:b/>
-          <w:bCs/>
-          <w:lang w:val="pt-BR"/>
-        </w:rPr>
-      </w:pPr>
-      <w:r>
-        <w:rPr>
-          <w:b/>
-          <w:bCs/>
-          <w:lang w:val="pt-BR"/>
-        </w:rPr>
-        <w:t xml:space="preserve">2. Lógica de Detecção de Travamento (Cálculo do Escorregamento - </w:t>
-      </w:r>
-      <w:proofErr w:type="spellStart"/>
-      <w:r>
-        <w:rPr>
-          <w:b/>
-          <w:bCs/>
-          <w:lang w:val="pt-BR"/>
-        </w:rPr>
-        <w:t>Slip</w:t>
-      </w:r>
-      <w:proofErr w:type="spellEnd"/>
-      <w:r>
-        <w:rPr>
-          <w:b/>
-          <w:bCs/>
-          <w:lang w:val="pt-BR"/>
-        </w:rPr>
-        <w:t>):</w:t>
-      </w:r>
-    </w:p>
-    <w:p>
-      <w:pPr>
-        <w:rPr>
-          <w:lang w:val="pt-BR"/>
-        </w:rPr>
-      </w:pPr>
-      <w:r>
-        <w:rPr>
-          <w:lang w:val="pt-BR"/>
-        </w:rPr>
-        <w:t>A ECU ABS funciona monitorando o "escorregamento" (</w:t>
-      </w:r>
-      <w:proofErr w:type="spellStart"/>
-      <w:r>
-        <w:rPr>
-          <w:lang w:val="pt-BR"/>
-        </w:rPr>
-        <w:t>slip</w:t>
-      </w:r>
-      <w:proofErr w:type="spellEnd"/>
-      <w:r>
-        <w:rPr>
-          <w:lang w:val="pt-BR"/>
-        </w:rPr>
-        <w:t>) de cada roda.</w:t>
+        <w:t xml:space="preserve"> Um valor constante (ex: 25 m/s). Em um sistema real, esta seria uma velocidade calculada dinamicamente, mas para simplificação, usamos uma constante para representar uma velocidade média do veículo durante a frenagem.</w:t>
+      </w:r>
+    </w:p>
+    <w:p>
+      <w:pPr>
+        <w:rPr>
+          <w:b/>
+          <w:bCs/>
+          <w:lang w:val="pt-BR"/>
+        </w:rPr>
+      </w:pPr>
+      <w:r>
+        <w:rPr>
+          <w:b/>
+          <w:bCs/>
+          <w:lang w:val="pt-BR"/>
+        </w:rPr>
+        <w:t>2. Lógica de Detecção de Travamento (Cálculo do Escorregamento - Slip):</w:t>
+      </w:r>
+    </w:p>
+    <w:p>
+      <w:pPr>
+        <w:rPr>
+          <w:lang w:val="pt-BR"/>
+        </w:rPr>
+      </w:pPr>
+      <w:r>
+        <w:rPr>
+          <w:lang w:val="pt-BR"/>
+        </w:rPr>
+        <w:t>A ECU ABS funciona monitorando o "escorregamento" (slip) de cada roda.</w:t>
       </w:r>
     </w:p>
     <w:p>
@@ -360,25 +220,7 @@
           <w:bCs/>
           <w:lang w:val="pt-BR"/>
         </w:rPr>
-        <w:t xml:space="preserve">Cálculo do </w:t>
-      </w:r>
-      <w:proofErr w:type="spellStart"/>
-      <w:r>
-        <w:rPr>
-          <w:b/>
-          <w:bCs/>
-          <w:lang w:val="pt-BR"/>
-        </w:rPr>
-        <w:t>Slip</w:t>
-      </w:r>
-      <w:proofErr w:type="spellEnd"/>
-      <w:r>
-        <w:rPr>
-          <w:b/>
-          <w:bCs/>
-          <w:lang w:val="pt-BR"/>
-        </w:rPr>
-        <w:t>:</w:t>
+        <w:t>Cálculo do Slip:</w:t>
       </w:r>
       <w:r>
         <w:rPr>
@@ -389,27 +231,50 @@
     </w:p>
     <w:p>
       <w:pPr>
-        <w:numPr>
-          <w:ilvl w:val="1"/>
-          <w:numId w:val="2"/>
-        </w:numPr>
-        <w:rPr>
-          <w:lang w:val="pt-BR"/>
-        </w:rPr>
-      </w:pPr>
-      <w:proofErr w:type="spellStart"/>
-      <w:r>
-        <w:rPr>
-          <w:lang w:val="pt-BR"/>
-        </w:rPr>
-        <w:t>Slip</w:t>
-      </w:r>
-      <w:proofErr w:type="spellEnd"/>
-      <w:r>
-        <w:rPr>
-          <w:lang w:val="pt-BR"/>
-        </w:rPr>
-        <w:t xml:space="preserve"> = (Velocidade da Roda - Velocidade Veículo Ref.) / Velocidade Veículo Ref.</w:t>
+        <w:ind w:left="720"/>
+        <w:rPr>
+          <w:lang w:val="pt-BR"/>
+        </w:rPr>
+      </w:pPr>
+      <w:r>
+        <w:rPr>
+          <w:noProof/>
+        </w:rPr>
+        <w:drawing>
+          <wp:inline distT="0" distB="0" distL="0" distR="0" wp14:anchorId="6354D30F" wp14:editId="572AF387">
+            <wp:extent cx="3305175" cy="600075"/>
+            <wp:effectExtent l="0" t="0" r="9525" b="9525"/>
+            <wp:docPr id="1060004707" name="Picture 1" descr="Texto&#10;&#10;O conteúdo gerado por IA pode estar incorreto."/>
+            <wp:cNvGraphicFramePr>
+              <a:graphicFrameLocks xmlns:a="http://schemas.openxmlformats.org/drawingml/2006/main" noChangeAspect="1"/>
+            </wp:cNvGraphicFramePr>
+            <a:graphic xmlns:a="http://schemas.openxmlformats.org/drawingml/2006/main">
+              <a:graphicData uri="http://schemas.openxmlformats.org/drawingml/2006/picture">
+                <pic:pic xmlns:pic="http://schemas.openxmlformats.org/drawingml/2006/picture">
+                  <pic:nvPicPr>
+                    <pic:cNvPr id="1060004707" name="Picture 1" descr="Texto&#10;&#10;O conteúdo gerado por IA pode estar incorreto."/>
+                    <pic:cNvPicPr/>
+                  </pic:nvPicPr>
+                  <pic:blipFill>
+                    <a:blip r:embed="rId5"/>
+                    <a:stretch>
+                      <a:fillRect/>
+                    </a:stretch>
+                  </pic:blipFill>
+                  <pic:spPr>
+                    <a:xfrm>
+                      <a:off x="0" y="0"/>
+                      <a:ext cx="3305175" cy="600075"/>
+                    </a:xfrm>
+                    <a:prstGeom prst="rect">
+                      <a:avLst/>
+                    </a:prstGeom>
+                  </pic:spPr>
+                </pic:pic>
+              </a:graphicData>
+            </a:graphic>
+          </wp:inline>
+        </w:drawing>
       </w:r>
     </w:p>
     <w:p>
@@ -436,95 +301,19 @@
         </w:rPr>
         <w:t xml:space="preserve"> Um </w:t>
       </w:r>
-      <w:proofErr w:type="spellStart"/>
-      <w:r>
-        <w:rPr>
-          <w:b/>
-          <w:bCs/>
-          <w:lang w:val="pt-BR"/>
-        </w:rPr>
-        <w:t>Relational</w:t>
-      </w:r>
-      <w:proofErr w:type="spellEnd"/>
-      <w:r>
-        <w:rPr>
-          <w:b/>
-          <w:bCs/>
-          <w:lang w:val="pt-BR"/>
-        </w:rPr>
-        <w:t xml:space="preserve"> </w:t>
-      </w:r>
-      <w:proofErr w:type="spellStart"/>
-      <w:r>
-        <w:rPr>
-          <w:b/>
-          <w:bCs/>
-          <w:lang w:val="pt-BR"/>
-        </w:rPr>
-        <w:t>Operator</w:t>
-      </w:r>
-      <w:proofErr w:type="spellEnd"/>
-      <w:r>
-        <w:rPr>
-          <w:lang w:val="pt-BR"/>
-        </w:rPr>
-        <w:t xml:space="preserve"> compara este valor de </w:t>
-      </w:r>
-      <w:proofErr w:type="spellStart"/>
-      <w:r>
-        <w:rPr>
-          <w:lang w:val="pt-BR"/>
-        </w:rPr>
-        <w:t>Slip</w:t>
-      </w:r>
-      <w:proofErr w:type="spellEnd"/>
-      <w:r>
-        <w:rPr>
-          <w:lang w:val="pt-BR"/>
-        </w:rPr>
-        <w:t xml:space="preserve"> com um limiar negativo (</w:t>
-      </w:r>
-      <w:proofErr w:type="spellStart"/>
-      <w:r>
-        <w:rPr>
-          <w:lang w:val="pt-BR"/>
-        </w:rPr>
-        <w:t>ex</w:t>
-      </w:r>
-      <w:proofErr w:type="spellEnd"/>
-      <w:r>
-        <w:rPr>
-          <w:lang w:val="pt-BR"/>
-        </w:rPr>
-        <w:t xml:space="preserve">: -0.2). Se o </w:t>
-      </w:r>
-      <w:proofErr w:type="spellStart"/>
-      <w:r>
-        <w:rPr>
-          <w:lang w:val="pt-BR"/>
-        </w:rPr>
-        <w:t>Slip</w:t>
-      </w:r>
-      <w:proofErr w:type="spellEnd"/>
-      <w:r>
-        <w:rPr>
-          <w:lang w:val="pt-BR"/>
-        </w:rPr>
-        <w:t xml:space="preserve"> for menor que -0.2 (indicando que a roda está girando significativamente mais lenta que o veículo, ou seja, escorregando e se aproximando do travamento), a saída deste bloco se </w:t>
-      </w:r>
-      <w:proofErr w:type="gramStart"/>
-      <w:r>
-        <w:rPr>
-          <w:lang w:val="pt-BR"/>
-        </w:rPr>
-        <w:t>torna Verdadeiro</w:t>
-      </w:r>
-      <w:proofErr w:type="gramEnd"/>
-      <w:r>
-        <w:rPr>
-          <w:lang w:val="pt-BR"/>
-        </w:rPr>
-        <w:t xml:space="preserve"> (1).</w:t>
+      <w:r>
+        <w:rPr>
+          <w:b/>
+          <w:bCs/>
+          <w:lang w:val="pt-BR"/>
+        </w:rPr>
+        <w:t>Relational Operator</w:t>
+      </w:r>
+      <w:r>
+        <w:rPr>
+          <w:lang w:val="pt-BR"/>
+        </w:rPr>
+        <w:t xml:space="preserve"> compara este valor de Slip com um limiar negativo (ex: -0.2). Se o Slip for menor que -0.2 (indicando que a roda está girando significativamente mais lenta que o veículo, ou seja, escorregando e se aproximando do travamento), a saída deste bloco se torna Verdadeiro (1).</w:t>
       </w:r>
     </w:p>
     <w:p>
@@ -552,34 +341,14 @@
         </w:rPr>
         <w:t xml:space="preserve"> Um </w:t>
       </w:r>
-      <w:proofErr w:type="spellStart"/>
-      <w:r>
-        <w:rPr>
-          <w:b/>
-          <w:bCs/>
-          <w:lang w:val="pt-BR"/>
-        </w:rPr>
-        <w:t>Logical</w:t>
-      </w:r>
-      <w:proofErr w:type="spellEnd"/>
-      <w:r>
-        <w:rPr>
-          <w:b/>
-          <w:bCs/>
-          <w:lang w:val="pt-BR"/>
-        </w:rPr>
-        <w:t xml:space="preserve"> </w:t>
-      </w:r>
-      <w:proofErr w:type="spellStart"/>
-      <w:r>
-        <w:rPr>
-          <w:b/>
-          <w:bCs/>
-          <w:lang w:val="pt-BR"/>
-        </w:rPr>
-        <w:t>Operator</w:t>
-      </w:r>
-      <w:proofErr w:type="spellEnd"/>
+      <w:r>
+        <w:rPr>
+          <w:b/>
+          <w:bCs/>
+          <w:lang w:val="pt-BR"/>
+        </w:rPr>
+        <w:t>Logical Operator</w:t>
+      </w:r>
       <w:r>
         <w:rPr>
           <w:lang w:val="pt-BR"/>
@@ -661,25 +430,7 @@
           <w:bCs/>
           <w:lang w:val="pt-BR"/>
         </w:rPr>
-        <w:t xml:space="preserve">Seleção do Duty </w:t>
-      </w:r>
-      <w:proofErr w:type="spellStart"/>
-      <w:r>
-        <w:rPr>
-          <w:b/>
-          <w:bCs/>
-          <w:lang w:val="pt-BR"/>
-        </w:rPr>
-        <w:t>Cycle</w:t>
-      </w:r>
-      <w:proofErr w:type="spellEnd"/>
-      <w:r>
-        <w:rPr>
-          <w:b/>
-          <w:bCs/>
-          <w:lang w:val="pt-BR"/>
-        </w:rPr>
-        <w:t>:</w:t>
+        <w:t>Seleção do Duty Cycle:</w:t>
       </w:r>
       <w:r>
         <w:rPr>
@@ -699,21 +450,7 @@
         <w:rPr>
           <w:lang w:val="pt-BR"/>
         </w:rPr>
-        <w:t xml:space="preserve"> é usado para alternar o Duty </w:t>
-      </w:r>
-      <w:proofErr w:type="spellStart"/>
-      <w:r>
-        <w:rPr>
-          <w:lang w:val="pt-BR"/>
-        </w:rPr>
-        <w:t>Cycle</w:t>
-      </w:r>
-      <w:proofErr w:type="spellEnd"/>
-      <w:r>
-        <w:rPr>
-          <w:lang w:val="pt-BR"/>
-        </w:rPr>
-        <w:t xml:space="preserve"> (ciclo de trabalho) do sinal PWM que controla a válvula do freio:</w:t>
+        <w:t xml:space="preserve"> é usado para alternar o Duty Cycle (ciclo de trabalho) do sinal PWM que controla a válvula do freio:</w:t>
       </w:r>
     </w:p>
     <w:p>
@@ -752,43 +489,7 @@
           <w:bCs/>
           <w:lang w:val="pt-BR"/>
         </w:rPr>
-        <w:t xml:space="preserve">Duty </w:t>
-      </w:r>
-      <w:proofErr w:type="spellStart"/>
-      <w:r>
-        <w:rPr>
-          <w:b/>
-          <w:bCs/>
-          <w:lang w:val="pt-BR"/>
-        </w:rPr>
-        <w:t>Cycle</w:t>
-      </w:r>
-      <w:proofErr w:type="spellEnd"/>
-      <w:r>
-        <w:rPr>
-          <w:b/>
-          <w:bCs/>
-          <w:lang w:val="pt-BR"/>
-        </w:rPr>
-        <w:t xml:space="preserve"> ALTO (</w:t>
-      </w:r>
-      <w:proofErr w:type="spellStart"/>
-      <w:r>
-        <w:rPr>
-          <w:b/>
-          <w:bCs/>
-          <w:lang w:val="pt-BR"/>
-        </w:rPr>
-        <w:t>ex</w:t>
-      </w:r>
-      <w:proofErr w:type="spellEnd"/>
-      <w:r>
-        <w:rPr>
-          <w:b/>
-          <w:bCs/>
-          <w:lang w:val="pt-BR"/>
-        </w:rPr>
-        <w:t>: 90%)</w:t>
+        <w:t>Duty Cycle ALTO (ex: 90%)</w:t>
       </w:r>
       <w:r>
         <w:rPr>
@@ -833,43 +534,7 @@
           <w:bCs/>
           <w:lang w:val="pt-BR"/>
         </w:rPr>
-        <w:t xml:space="preserve">Duty </w:t>
-      </w:r>
-      <w:proofErr w:type="spellStart"/>
-      <w:r>
-        <w:rPr>
-          <w:b/>
-          <w:bCs/>
-          <w:lang w:val="pt-BR"/>
-        </w:rPr>
-        <w:t>Cycle</w:t>
-      </w:r>
-      <w:proofErr w:type="spellEnd"/>
-      <w:r>
-        <w:rPr>
-          <w:b/>
-          <w:bCs/>
-          <w:lang w:val="pt-BR"/>
-        </w:rPr>
-        <w:t xml:space="preserve"> BAIXO (</w:t>
-      </w:r>
-      <w:proofErr w:type="spellStart"/>
-      <w:r>
-        <w:rPr>
-          <w:b/>
-          <w:bCs/>
-          <w:lang w:val="pt-BR"/>
-        </w:rPr>
-        <w:t>ex</w:t>
-      </w:r>
-      <w:proofErr w:type="spellEnd"/>
-      <w:r>
-        <w:rPr>
-          <w:b/>
-          <w:bCs/>
-          <w:lang w:val="pt-BR"/>
-        </w:rPr>
-        <w:t>: 30%)</w:t>
+        <w:t>Duty Cycle BAIXO (ex: 30%)</w:t>
       </w:r>
       <w:r>
         <w:rPr>
@@ -914,21 +579,7 @@
         <w:rPr>
           <w:lang w:val="pt-BR"/>
         </w:rPr>
-        <w:t xml:space="preserve"> O valor do Duty </w:t>
-      </w:r>
-      <w:proofErr w:type="spellStart"/>
-      <w:r>
-        <w:rPr>
-          <w:lang w:val="pt-BR"/>
-        </w:rPr>
-        <w:t>Cycle</w:t>
-      </w:r>
-      <w:proofErr w:type="spellEnd"/>
-      <w:r>
-        <w:rPr>
-          <w:lang w:val="pt-BR"/>
-        </w:rPr>
-        <w:t xml:space="preserve"> selecionado é enviado para um bloco </w:t>
+        <w:t xml:space="preserve"> O valor do Duty Cycle selecionado é enviado para um bloco </w:t>
       </w:r>
       <w:r>
         <w:rPr>
@@ -942,49 +593,7 @@
         <w:rPr>
           <w:lang w:val="pt-BR"/>
         </w:rPr>
-        <w:t xml:space="preserve"> (</w:t>
-      </w:r>
-      <w:proofErr w:type="spellStart"/>
-      <w:r>
-        <w:rPr>
-          <w:lang w:val="pt-BR"/>
-        </w:rPr>
-        <w:t>Simulink</w:t>
-      </w:r>
-      <w:proofErr w:type="spellEnd"/>
-      <w:r>
-        <w:rPr>
-          <w:lang w:val="pt-BR"/>
-        </w:rPr>
-        <w:t xml:space="preserve"> &gt; </w:t>
-      </w:r>
-      <w:proofErr w:type="spellStart"/>
-      <w:r>
-        <w:rPr>
-          <w:lang w:val="pt-BR"/>
-        </w:rPr>
-        <w:t>Discontinuities</w:t>
-      </w:r>
-      <w:proofErr w:type="spellEnd"/>
-      <w:r>
-        <w:rPr>
-          <w:lang w:val="pt-BR"/>
-        </w:rPr>
-        <w:t>) que gera o sinal de pulso modulado por largura (PWM) com uma frequência definida (</w:t>
-      </w:r>
-      <w:proofErr w:type="spellStart"/>
-      <w:r>
-        <w:rPr>
-          <w:lang w:val="pt-BR"/>
-        </w:rPr>
-        <w:t>ex</w:t>
-      </w:r>
-      <w:proofErr w:type="spellEnd"/>
-      <w:r>
-        <w:rPr>
-          <w:lang w:val="pt-BR"/>
-        </w:rPr>
-        <w:t>: 200 Hz).</w:t>
+        <w:t xml:space="preserve"> (Simulink &gt; Discontinuities) que gera o sinal de pulso modulado por largura (PWM) com uma frequência definida (ex: 200 Hz).</w:t>
       </w:r>
     </w:p>
     <w:p>
@@ -1011,7 +620,6 @@
         </w:rPr>
         <w:t xml:space="preserve"> Um bloco </w:t>
       </w:r>
-      <w:proofErr w:type="spellStart"/>
       <w:r>
         <w:rPr>
           <w:b/>
@@ -1020,102 +628,41 @@
         </w:rPr>
         <w:t>Gain</w:t>
       </w:r>
-      <w:proofErr w:type="spellEnd"/>
-      <w:r>
-        <w:rPr>
-          <w:lang w:val="pt-BR"/>
-        </w:rPr>
-        <w:t xml:space="preserve"> multiplica o sinal PWM por um valor (</w:t>
-      </w:r>
-      <w:proofErr w:type="spellStart"/>
-      <w:r>
-        <w:rPr>
-          <w:lang w:val="pt-BR"/>
-        </w:rPr>
-        <w:t>ex</w:t>
-      </w:r>
-      <w:proofErr w:type="spellEnd"/>
-      <w:r>
-        <w:rPr>
-          <w:lang w:val="pt-BR"/>
-        </w:rPr>
-        <w:t>: 5) para simular a amplitude de voltagem correta (</w:t>
-      </w:r>
-      <w:proofErr w:type="spellStart"/>
-      <w:r>
-        <w:rPr>
-          <w:lang w:val="pt-BR"/>
-        </w:rPr>
-        <w:t>ex</w:t>
-      </w:r>
-      <w:proofErr w:type="spellEnd"/>
-      <w:r>
-        <w:rPr>
-          <w:lang w:val="pt-BR"/>
-        </w:rPr>
-        <w:t>: 5V) para acionar uma válvula real.</w:t>
-      </w:r>
-    </w:p>
-    <w:p>
-      <w:pPr>
-        <w:rPr>
-          <w:b/>
-          <w:bCs/>
-          <w:lang w:val="pt-BR"/>
-        </w:rPr>
-      </w:pPr>
-      <w:r>
-        <w:rPr>
-          <w:b/>
-          <w:bCs/>
-          <w:lang w:val="pt-BR"/>
-        </w:rPr>
-        <w:t xml:space="preserve">4. Resultados Esperados nos </w:t>
-      </w:r>
-      <w:proofErr w:type="spellStart"/>
-      <w:r>
-        <w:rPr>
-          <w:b/>
-          <w:bCs/>
-          <w:lang w:val="pt-BR"/>
-        </w:rPr>
-        <w:t>Scopes</w:t>
-      </w:r>
-      <w:proofErr w:type="spellEnd"/>
-      <w:r>
-        <w:rPr>
-          <w:b/>
-          <w:bCs/>
-          <w:lang w:val="pt-BR"/>
-        </w:rPr>
-        <w:t>:</w:t>
-      </w:r>
-    </w:p>
-    <w:p>
-      <w:pPr>
-        <w:rPr>
-          <w:lang w:val="pt-BR"/>
-        </w:rPr>
-      </w:pPr>
-      <w:r>
-        <w:rPr>
-          <w:lang w:val="pt-BR"/>
-        </w:rPr>
-        <w:t xml:space="preserve">Ao rodar a simulação, você deve observar os seguintes comportamentos nos seus blocos </w:t>
-      </w:r>
-      <w:proofErr w:type="spellStart"/>
-      <w:r>
-        <w:rPr>
-          <w:lang w:val="pt-BR"/>
-        </w:rPr>
-        <w:t>Scope</w:t>
-      </w:r>
-      <w:proofErr w:type="spellEnd"/>
-      <w:r>
-        <w:rPr>
-          <w:lang w:val="pt-BR"/>
-        </w:rPr>
-        <w:t>:</w:t>
+      <w:r>
+        <w:rPr>
+          <w:lang w:val="pt-BR"/>
+        </w:rPr>
+        <w:t xml:space="preserve"> multiplica o sinal PWM por um valor (ex: 5) para simular a amplitude de voltagem correta (ex: 5V) para acionar uma válvula real.</w:t>
+      </w:r>
+    </w:p>
+    <w:p>
+      <w:pPr>
+        <w:rPr>
+          <w:b/>
+          <w:bCs/>
+          <w:lang w:val="pt-BR"/>
+        </w:rPr>
+      </w:pPr>
+      <w:r>
+        <w:rPr>
+          <w:b/>
+          <w:bCs/>
+          <w:lang w:val="pt-BR"/>
+        </w:rPr>
+        <w:t>4. Resultados Esperados nos Scopes:</w:t>
+      </w:r>
+    </w:p>
+    <w:p>
+      <w:pPr>
+        <w:rPr>
+          <w:lang w:val="pt-BR"/>
+        </w:rPr>
+      </w:pPr>
+      <w:r>
+        <w:rPr>
+          <w:lang w:val="pt-BR"/>
+        </w:rPr>
+        <w:t>Ao rodar a simulação, você deve observar os seguintes comportamentos nos seus blocos Scope:</w:t>
       </w:r>
     </w:p>
     <w:p>
@@ -1130,23 +677,7 @@
           <w:b/>
           <w:bCs/>
         </w:rPr>
-        <w:t>Scope "Scope Input" (</w:t>
-      </w:r>
-      <w:proofErr w:type="spellStart"/>
-      <w:r>
-        <w:rPr>
-          <w:b/>
-          <w:bCs/>
-        </w:rPr>
-        <w:t>Velocidades</w:t>
-      </w:r>
-      <w:proofErr w:type="spellEnd"/>
-      <w:r>
-        <w:rPr>
-          <w:b/>
-          <w:bCs/>
-        </w:rPr>
-        <w:t>):</w:t>
+        <w:t>Scope "Scope Input" (Velocidades):</w:t>
       </w:r>
     </w:p>
     <w:p>
@@ -1163,35 +694,7 @@
         <w:rPr>
           <w:lang w:val="pt-BR"/>
         </w:rPr>
-        <w:t>Você verá as linhas de velocidade das quatro rodas começando em um valor alto e caindo para um valor baixo (</w:t>
-      </w:r>
-      <w:proofErr w:type="spellStart"/>
-      <w:r>
-        <w:rPr>
-          <w:lang w:val="pt-BR"/>
-        </w:rPr>
-        <w:t>ex</w:t>
-      </w:r>
-      <w:proofErr w:type="spellEnd"/>
-      <w:r>
-        <w:rPr>
-          <w:lang w:val="pt-BR"/>
-        </w:rPr>
-        <w:t>: de 30 para 10 m/s) em um determinado tempo (</w:t>
-      </w:r>
-      <w:proofErr w:type="spellStart"/>
-      <w:r>
-        <w:rPr>
-          <w:lang w:val="pt-BR"/>
-        </w:rPr>
-        <w:t>ex</w:t>
-      </w:r>
-      <w:proofErr w:type="spellEnd"/>
-      <w:r>
-        <w:rPr>
-          <w:lang w:val="pt-BR"/>
-        </w:rPr>
-        <w:t>: 1 segundo), simulando a frenagem e o potencial travamento.</w:t>
+        <w:t>Você verá as linhas de velocidade das quatro rodas começando em um valor alto e caindo para um valor baixo (ex: de 30 para 10 m/s) em um determinado tempo (ex: 1 segundo), simulando a frenagem e o potencial travamento.</w:t>
       </w:r>
     </w:p>
     <w:p>
@@ -1208,21 +711,7 @@
         <w:rPr>
           <w:lang w:val="pt-BR"/>
         </w:rPr>
-        <w:t>A linha da "Velocidade Veículo Ref." permanecerá constante (</w:t>
-      </w:r>
-      <w:proofErr w:type="spellStart"/>
-      <w:r>
-        <w:rPr>
-          <w:lang w:val="pt-BR"/>
-        </w:rPr>
-        <w:t>ex</w:t>
-      </w:r>
-      <w:proofErr w:type="spellEnd"/>
-      <w:r>
-        <w:rPr>
-          <w:lang w:val="pt-BR"/>
-        </w:rPr>
-        <w:t>: 25 m/s).</w:t>
+        <w:t>A linha da "Velocidade Veículo Ref." permanecerá constante (ex: 25 m/s).</w:t>
       </w:r>
     </w:p>
     <w:p>
@@ -1237,23 +726,7 @@
           <w:b/>
           <w:bCs/>
         </w:rPr>
-        <w:t>Scope "Scope Output" (</w:t>
-      </w:r>
-      <w:proofErr w:type="spellStart"/>
-      <w:r>
-        <w:rPr>
-          <w:b/>
-          <w:bCs/>
-        </w:rPr>
-        <w:t>Lógica</w:t>
-      </w:r>
-      <w:proofErr w:type="spellEnd"/>
-      <w:r>
-        <w:rPr>
-          <w:b/>
-          <w:bCs/>
-        </w:rPr>
-        <w:t xml:space="preserve"> ABS e PWM):</w:t>
+        <w:t>Scope "Scope Output" (Lógica ABS e PWM):</w:t>
       </w:r>
     </w:p>
     <w:p>
@@ -1263,37 +736,12 @@
           <w:numId w:val="4"/>
         </w:numPr>
       </w:pPr>
-      <w:proofErr w:type="spellStart"/>
-      <w:r>
-        <w:rPr>
-          <w:b/>
-          <w:bCs/>
-        </w:rPr>
-        <w:t>Sinal</w:t>
-      </w:r>
-      <w:proofErr w:type="spellEnd"/>
-      <w:r>
-        <w:rPr>
-          <w:b/>
-          <w:bCs/>
-        </w:rPr>
-        <w:t xml:space="preserve"> "</w:t>
-      </w:r>
-      <w:proofErr w:type="spellStart"/>
-      <w:r>
-        <w:rPr>
-          <w:b/>
-          <w:bCs/>
-        </w:rPr>
-        <w:t>Ativar</w:t>
-      </w:r>
-      <w:proofErr w:type="spellEnd"/>
-      <w:r>
-        <w:rPr>
-          <w:b/>
-          <w:bCs/>
-        </w:rPr>
-        <w:t xml:space="preserve"> ABS":</w:t>
+      <w:r>
+        <w:rPr>
+          <w:b/>
+          <w:bCs/>
+        </w:rPr>
+        <w:t>Sinal "Ativar ABS":</w:t>
       </w:r>
     </w:p>
     <w:p>
@@ -1342,35 +790,7 @@
           <w:lang w:val="pt-BR"/>
         </w:rPr>
         <w:lastRenderedPageBreak/>
-        <w:t xml:space="preserve">Quando a velocidade de uma ou mais rodas cair o suficiente para que o </w:t>
-      </w:r>
-      <w:proofErr w:type="spellStart"/>
-      <w:r>
-        <w:rPr>
-          <w:lang w:val="pt-BR"/>
-        </w:rPr>
-        <w:t>Slip</w:t>
-      </w:r>
-      <w:proofErr w:type="spellEnd"/>
-      <w:r>
-        <w:rPr>
-          <w:lang w:val="pt-BR"/>
-        </w:rPr>
-        <w:t xml:space="preserve"> atinja o critério de travamento (</w:t>
-      </w:r>
-      <w:proofErr w:type="spellStart"/>
-      <w:r>
-        <w:rPr>
-          <w:lang w:val="pt-BR"/>
-        </w:rPr>
-        <w:t>ex</w:t>
-      </w:r>
-      <w:proofErr w:type="spellEnd"/>
-      <w:r>
-        <w:rPr>
-          <w:lang w:val="pt-BR"/>
-        </w:rPr>
-        <w:t xml:space="preserve">: após 1 segundo), o sinal "Ativar ABS" subirá para </w:t>
+        <w:t xml:space="preserve">Quando a velocidade de uma ou mais rodas cair o suficiente para que o Slip atinja o critério de travamento (ex: após 1 segundo), o sinal "Ativar ABS" subirá para </w:t>
       </w:r>
       <w:r>
         <w:rPr>
@@ -1439,37 +859,12 @@
           <w:numId w:val="4"/>
         </w:numPr>
       </w:pPr>
-      <w:proofErr w:type="spellStart"/>
-      <w:r>
-        <w:rPr>
-          <w:b/>
-          <w:bCs/>
-        </w:rPr>
-        <w:t>Sinal</w:t>
-      </w:r>
-      <w:proofErr w:type="spellEnd"/>
-      <w:r>
-        <w:rPr>
-          <w:b/>
-          <w:bCs/>
-        </w:rPr>
-        <w:t xml:space="preserve"> "PWM </w:t>
-      </w:r>
-      <w:proofErr w:type="spellStart"/>
-      <w:r>
-        <w:rPr>
-          <w:b/>
-          <w:bCs/>
-        </w:rPr>
-        <w:t>Válvula</w:t>
-      </w:r>
-      <w:proofErr w:type="spellEnd"/>
-      <w:r>
-        <w:rPr>
-          <w:b/>
-          <w:bCs/>
-        </w:rPr>
-        <w:t xml:space="preserve"> Freio":</w:t>
+      <w:r>
+        <w:rPr>
+          <w:b/>
+          <w:bCs/>
+        </w:rPr>
+        <w:t>Sinal "PWM Válvula Freio":</w:t>
       </w:r>
     </w:p>
     <w:p>
@@ -1494,25 +889,7 @@
           <w:bCs/>
           <w:lang w:val="pt-BR"/>
         </w:rPr>
-        <w:t>ciclo de trabalho ALTO (</w:t>
-      </w:r>
-      <w:proofErr w:type="spellStart"/>
-      <w:r>
-        <w:rPr>
-          <w:b/>
-          <w:bCs/>
-          <w:lang w:val="pt-BR"/>
-        </w:rPr>
-        <w:t>ex</w:t>
-      </w:r>
-      <w:proofErr w:type="spellEnd"/>
-      <w:r>
-        <w:rPr>
-          <w:b/>
-          <w:bCs/>
-          <w:lang w:val="pt-BR"/>
-        </w:rPr>
-        <w:t>: 90%)</w:t>
+        <w:t>ciclo de trabalho ALTO (ex: 90%)</w:t>
       </w:r>
       <w:r>
         <w:rPr>
@@ -1531,45 +908,19 @@
           <w:lang w:val="pt-BR"/>
         </w:rPr>
       </w:pPr>
-      <w:proofErr w:type="gramStart"/>
-      <w:r>
-        <w:rPr>
-          <w:lang w:val="pt-BR"/>
-        </w:rPr>
-        <w:t>No momento em que</w:t>
-      </w:r>
-      <w:proofErr w:type="gramEnd"/>
-      <w:r>
-        <w:rPr>
-          <w:lang w:val="pt-BR"/>
-        </w:rPr>
-        <w:t xml:space="preserve"> o sinal "Ativar ABS" subir para 1, o PWM mudará instantaneamente para um </w:t>
-      </w:r>
-      <w:r>
-        <w:rPr>
-          <w:b/>
-          <w:bCs/>
-          <w:lang w:val="pt-BR"/>
-        </w:rPr>
-        <w:t>ciclo de trabalho BAIXO (</w:t>
-      </w:r>
-      <w:proofErr w:type="spellStart"/>
-      <w:r>
-        <w:rPr>
-          <w:b/>
-          <w:bCs/>
-          <w:lang w:val="pt-BR"/>
-        </w:rPr>
-        <w:t>ex</w:t>
-      </w:r>
-      <w:proofErr w:type="spellEnd"/>
-      <w:r>
-        <w:rPr>
-          <w:b/>
-          <w:bCs/>
-          <w:lang w:val="pt-BR"/>
-        </w:rPr>
-        <w:t>: 30%)</w:t>
+      <w:r>
+        <w:rPr>
+          <w:lang w:val="pt-BR"/>
+        </w:rPr>
+        <w:t xml:space="preserve">No momento em que o sinal "Ativar ABS" subir para 1, o PWM mudará instantaneamente para um </w:t>
+      </w:r>
+      <w:r>
+        <w:rPr>
+          <w:b/>
+          <w:bCs/>
+          <w:lang w:val="pt-BR"/>
+        </w:rPr>
+        <w:t>ciclo de trabalho BAIXO (ex: 30%)</w:t>
       </w:r>
       <w:r>
         <w:rPr>
@@ -1697,6 +1048,7 @@
       </w:pPr>
       <w:r>
         <w:rPr>
+          <w:noProof/>
           <w:lang w:val="pt-BR"/>
         </w:rPr>
         <w:drawing>
@@ -1715,7 +1067,7 @@
                     <pic:cNvPicPr/>
                   </pic:nvPicPr>
                   <pic:blipFill>
-                    <a:blip r:embed="rId5"/>
+                    <a:blip r:embed="rId6"/>
                     <a:stretch>
                       <a:fillRect/>
                     </a:stretch>
@@ -1768,6 +1120,7 @@
       </w:pPr>
       <w:r>
         <w:rPr>
+          <w:noProof/>
           <w:lang w:val="pt-BR"/>
         </w:rPr>
         <w:drawing>
@@ -1786,7 +1139,7 @@
                     <pic:cNvPicPr/>
                   </pic:nvPicPr>
                   <pic:blipFill>
-                    <a:blip r:embed="rId6"/>
+                    <a:blip r:embed="rId7"/>
                     <a:stretch>
                       <a:fillRect/>
                     </a:stretch>

</xml_diff>

<commit_message>
Atualização do arquivo Funcionamento e Resultados Esperados da Simulação de ECU ABS no Simulink.docx e acrescimo da pasta Software
</commit_message>
<xml_diff>
--- a/Funcionamento e Resultados Esperados da Simulação de ECU ABS no Simulink.docx
+++ b/Funcionamento e Resultados Esperados da Simulação de ECU ABS no Simulink.docx
@@ -1048,14 +1048,13 @@
       </w:pPr>
       <w:r>
         <w:rPr>
-          <w:noProof/>
           <w:lang w:val="pt-BR"/>
         </w:rPr>
         <w:drawing>
-          <wp:inline distT="0" distB="0" distL="0" distR="0" wp14:anchorId="3C2F3DF3" wp14:editId="08B0614B">
-            <wp:extent cx="5943600" cy="2612390"/>
+          <wp:inline distT="0" distB="0" distL="0" distR="0" wp14:anchorId="261BF52A" wp14:editId="0706E333">
+            <wp:extent cx="5943600" cy="2268855"/>
             <wp:effectExtent l="0" t="0" r="0" b="0"/>
-            <wp:docPr id="542298243" name="Imagem 1" descr="Diagrama, Esquemático&#10;&#10;O conteúdo gerado por IA pode estar incorreto."/>
+            <wp:docPr id="258740928" name="Imagem 1"/>
             <wp:cNvGraphicFramePr>
               <a:graphicFrameLocks xmlns:a="http://schemas.openxmlformats.org/drawingml/2006/main" noChangeAspect="1"/>
             </wp:cNvGraphicFramePr>
@@ -1063,7 +1062,7 @@
               <a:graphicData uri="http://schemas.openxmlformats.org/drawingml/2006/picture">
                 <pic:pic xmlns:pic="http://schemas.openxmlformats.org/drawingml/2006/picture">
                   <pic:nvPicPr>
-                    <pic:cNvPr id="542298243" name="Imagem 1" descr="Diagrama, Esquemático&#10;&#10;O conteúdo gerado por IA pode estar incorreto."/>
+                    <pic:cNvPr id="258740928" name=""/>
                     <pic:cNvPicPr/>
                   </pic:nvPicPr>
                   <pic:blipFill>
@@ -1075,7 +1074,7 @@
                   <pic:spPr>
                     <a:xfrm>
                       <a:off x="0" y="0"/>
-                      <a:ext cx="5943600" cy="2612390"/>
+                      <a:ext cx="5943600" cy="2268855"/>
                     </a:xfrm>
                     <a:prstGeom prst="rect">
                       <a:avLst/>

</xml_diff>